<commit_message>
Cap nhat bao cao: them link GitHub
</commit_message>
<xml_diff>
--- a/B23DCAT316_BaoCao_Bai2_IoT.docx
+++ b/B23DCAT316_BaoCao_Bai2_IoT.docx
@@ -427,7 +427,7 @@
                 <w:sz w:val="21"/>
                 <w:szCs w:val="21"/>
               </w:rPr>
-              <w:t xml:space="preserve">Mã nguồn</w:t>
+              <w:t xml:space="preserve">Mã nguồn (GitHub)</w:t>
             </w:r>
           </w:p>
         </w:tc>
@@ -458,7 +458,7 @@
                 <w:sz w:val="21"/>
                 <w:szCs w:val="21"/>
               </w:rPr>
-              <w:t xml:space="preserve">Thư mục iot-lab2 (README.md hướng dẫn chạy)</w:t>
+              <w:t xml:space="preserve">https://github.com/chungnv05/iot-lab2</w:t>
             </w:r>
           </w:p>
         </w:tc>

</xml_diff>